<commit_message>
feat(typ2docx): shade captured fills, keep native mark for highlight
Two Word mechanisms, chosen by the source markup: Typst highlight
regions keep pandoc's native mark handling (the highlight pen), while
filled blocks and boxes (captured by the reader as background-color
attributes) map onto exact-named stock styles (ShadingBlock paragraph
band, ShadingInline character shading). Shading is Word's own
fill-color mechanism, so it covers display math, which the pen cannot.
The decisions log records the exact-name rule behind the withdrawn
first attempt.
</commit_message>
<xml_diff>
--- a/reference/reference.docx
+++ b/reference/reference.docx
@@ -1145,6 +1145,21 @@
       <w:b w:val="0"/>
       <w:bCs w:val="0"/>
       <w:color w:val="000000"/>
+    </w:rPr>
+  </w:style>
+  <w:style w:type="paragraph" w:styleId="ShadingBlock">
+    <w:name w:val="ShadingBlock"/>
+    <w:basedOn w:val="BodyText"/>
+    <w:qFormat/>
+    <w:pPr>
+      <w:shd w:val="clear" w:color="auto" w:fill="FFF3CD"/>
+    </w:pPr>
+  </w:style>
+  <w:style w:type="character" w:styleId="ShadingInline">
+    <w:name w:val="ShadingInline"/>
+    <w:qFormat/>
+    <w:rPr>
+      <w:shd w:val="clear" w:color="auto" w:fill="FFF3CD"/>
     </w:rPr>
   </w:style>
 </w:styles>

</xml_diff>

<commit_message>
fix(typ2docx): float margins, shaded tables, --build-reference
Spacing: the indent model zeroed BodyText spacing, and floats borrowed
their margins from it. first-line-indent.patch now restores the pristine
9pt at the displaced boundaries (FirstParagraph before below headings,
tables, figures, lists; TableCaption and Figure before above floats)
instead of inventing new values.

Shading: a table-only region now unwraps to a ShadedTable table style.
Through the div the block shading vanished (tables cannot take paragraph
styles; only cell text was shaded) and the writer left the following
paragraph in BodyText with no margin below the table. Shaded text
regions carry after=180 for the same reason. shading.patch is
regenerated with clean context; it previously applied only via fuzz.

CLI: abstract typ2docx [--build-reference] <file.typ> rebuilds the
stock from the patch series first; alone it is a full call.

Stock rebuilt from the amended series.
</commit_message>
<xml_diff>
--- a/reference/reference.docx
+++ b/reference/reference.docx
@@ -517,6 +517,9 @@
     <w:basedOn w:val="BodyText"/>
     <w:next w:val="BodyText"/>
     <w:qFormat/>
+    <w:pPr>
+      <w:spacing w:before="180"/>
+    </w:pPr>
   </w:style>
   <w:style w:type="paragraph" w:customStyle="1" w:styleId="Compact">
     <w:name w:val="Compact"/>
@@ -1078,6 +1081,7 @@
     <w:basedOn w:val="Caption"/>
     <w:pPr>
       <w:keepNext/>
+      <w:spacing w:before="180"/>
     </w:pPr>
   </w:style>
   <w:style w:type="paragraph" w:customStyle="1" w:styleId="ImageCaption">
@@ -1088,6 +1092,7 @@
     <w:name w:val="Figure"/>
     <w:basedOn w:val="Normal"/>
     <w:pPr>
+      <w:spacing w:before="180"/>
       <w:jc w:val="center"/>
     </w:pPr>
   </w:style>
@@ -1153,6 +1158,7 @@
     <w:qFormat/>
     <w:pPr>
       <w:shd w:val="clear" w:color="auto" w:fill="FFF3CD"/>
+      <w:spacing w:after="180"/>
     </w:pPr>
   </w:style>
   <w:style w:type="character" w:styleId="ShadingInline">
@@ -1161,6 +1167,13 @@
     <w:rPr>
       <w:shd w:val="clear" w:color="auto" w:fill="FFF3CD"/>
     </w:rPr>
+  </w:style>
+  <w:style w:type="table" w:customStyle="1" w:styleId="ShadedTable">
+    <w:name w:val="ShadedTable"/>
+    <w:basedOn w:val="Table"/>
+    <w:tblPr>
+      <w:shd w:val="clear" w:color="auto" w:fill="FFF3CD"/>
+    </w:tblPr>
   </w:style>
 </w:styles>
 </file>

</xml_diff>